<commit_message>
fix: quitar negritas de énfasis dentro de párrafos en los 4 artículos de backfill de septiembre
</commit_message>
<xml_diff>
--- a/articulos/2026-09-01-tequio-escolar-corresponsabilidad-comunitaria-norte-de-puebla.docx
+++ b/articulos/2026-09-01-tequio-escolar-corresponsabilidad-comunitaria-norte-de-puebla.docx
@@ -132,25 +132,7 @@
         <w:jc w:val="both"/>
       </w:pPr>
       <w:r>
-        <w:t xml:space="preserve">El </w:t>
-      </w:r>
-      <w:r>
-        <w:rPr>
-          <w:b/>
-        </w:rPr>
-        <w:t xml:space="preserve">objetivo general</w:t>
-      </w:r>
-      <w:r>
-        <w:t xml:space="preserve"> de este artículo es analizar de qué manera el tequio escolar y los Comités de Administración Participativa configuran la corresponsabilidad comunitaria en el sostenimiento material de escuelas primarias públicas de la región de Zacatlán, Chignahuapan y Ahuacatlán. Dado el carácter cualitativo y exploratorio del estudio, no se formula una hipótesis, sino la siguiente </w:t>
-      </w:r>
-      <w:r>
-        <w:rPr>
-          <w:b/>
-        </w:rPr>
-        <w:t xml:space="preserve">pregunta de investigación</w:t>
-      </w:r>
-      <w:r>
-        <w:t xml:space="preserve">: ¿de qué manera el tequio escolar y los Comités de Administración Participativa configuran la corresponsabilidad comunitaria en el sostenimiento material de escuelas primarias públicas de esta región del Norte de Puebla? Esta pregunta reaparece de manera literal en las secciones de resultados, discusión y conclusiones. La relevancia académica del trabajo consiste en aportar una mirada situada sobre el trabajo comunitario no remunerado como dimensión material, y no solo simbólica, de la corresponsabilidad educativa; su relevancia social radica en visibilizar quién asume efectivamente esa carga y con qué consecuencias para la equidad al interior de la comunidad escolar.</w:t>
+        <w:t xml:space="preserve">El objetivo general de este artículo es analizar de qué manera el tequio escolar y los Comités de Administración Participativa configuran la corresponsabilidad comunitaria en el sostenimiento material de escuelas primarias públicas de la región de Zacatlán, Chignahuapan y Ahuacatlán. Dado el carácter cualitativo y exploratorio del estudio, no se formula una hipótesis, sino la siguiente pregunta de investigación: ¿de qué manera el tequio escolar y los Comités de Administración Participativa configuran la corresponsabilidad comunitaria en el sostenimiento material de escuelas primarias públicas de esta región del Norte de Puebla? Esta pregunta reaparece de manera literal en las secciones de resultados, discusión y conclusiones. La relevancia académica del trabajo consiste en aportar una mirada situada sobre el trabajo comunitario no remunerado como dimensión material, y no solo simbólica, de la corresponsabilidad educativa; su relevancia social radica en visibilizar quién asume efectivamente esa carga y con qué consecuencias para la equidad al interior de la comunidad escolar.</w:t>
       </w:r>
     </w:p>
     <w:p>
@@ -255,25 +237,7 @@
         <w:jc w:val="both"/>
       </w:pPr>
       <w:r>
-        <w:t xml:space="preserve">El estudio adopta un </w:t>
-      </w:r>
-      <w:r>
-        <w:rPr>
-          <w:b/>
-        </w:rPr>
-        <w:t xml:space="preserve">enfoque cualitativo</w:t>
-      </w:r>
-      <w:r>
-        <w:t xml:space="preserve"> con apoyo de registro documental, adecuado para comprender el sentido y la organización de una práctica social situada, como el tequio escolar, más que para medir su magnitud de manera generalizable. El diseño es un </w:t>
-      </w:r>
-      <w:r>
-        <w:rPr>
-          <w:b/>
-        </w:rPr>
-        <w:t xml:space="preserve">estudio de caso</w:t>
-      </w:r>
-      <w:r>
-        <w:t xml:space="preserve"> en cuatro escuelas primarias públicas de tres municipios de la región de Zacatlán, Chignahuapan y Ahuacatlán, seleccionadas por contar con Comité de Administración Participativa activo y por reportar, según los propios directores, jornadas de tequio escolar en los últimos tres ciclos escolares.</w:t>
+        <w:t xml:space="preserve">El estudio adopta un enfoque cualitativo con apoyo de registro documental, adecuado para comprender el sentido y la organización de una práctica social situada, como el tequio escolar, más que para medir su magnitud de manera generalizable. El diseño es un estudio de caso en cuatro escuelas primarias públicas de tres municipios de la región de Zacatlán, Chignahuapan y Ahuacatlán, seleccionadas por contar con Comité de Administración Participativa activo y por reportar, según los propios directores, jornadas de tequio escolar en los últimos tres ciclos escolares.</w:t>
       </w:r>
     </w:p>
     <w:p>
@@ -289,25 +253,7 @@
         <w:jc w:val="both"/>
       </w:pPr>
       <w:r>
-        <w:t xml:space="preserve">El corpus documental está integrado por </w:t>
-      </w:r>
-      <w:r>
-        <w:rPr>
-          <w:b/>
-        </w:rPr>
-        <w:t xml:space="preserve">veinte actas y registros</w:t>
-      </w:r>
-      <w:r>
-        <w:t xml:space="preserve"> del comité escolar de cada plantel, correspondientes a los ciclos 2023-2024, 2024-2025 y 2025-2026, entre minutas de asamblea, listas de asistencia a jornadas de tequio y comprobantes simplificados de uso de recursos del programa La Escuela es Nuestra. De manera complementaria, se realizaron </w:t>
-      </w:r>
-      <w:r>
-        <w:rPr>
-          <w:b/>
-        </w:rPr>
-        <w:t xml:space="preserve">dieciséis entrevistas semiestructuradas</w:t>
-      </w:r>
-      <w:r>
-        <w:t xml:space="preserve">: doce a integrantes de comités de madres y padres de familia, tres por escuela, y cuatro a directoras y directores, uno por escuela. Se trata de un corpus y una muestra ilustrativos y no probabilísticos, cuyos resultados no pretenden generalizarse estadísticamente al conjunto de la región. La Tabla 1 describe las escuelas del estudio.</w:t>
+        <w:t xml:space="preserve">El corpus documental está integrado por veinte actas y registros del comité escolar de cada plantel, correspondientes a los ciclos 2023-2024, 2024-2025 y 2025-2026, entre minutas de asamblea, listas de asistencia a jornadas de tequio y comprobantes simplificados de uso de recursos del programa La Escuela es Nuestra. De manera complementaria, se realizaron dieciséis entrevistas semiestructuradas: doce a integrantes de comités de madres y padres de familia, tres por escuela, y cuatro a directoras y directores, uno por escuela. Se trata de un corpus y una muestra ilustrativos y no probabilísticos, cuyos resultados no pretenden generalizarse estadísticamente al conjunto de la región. La Tabla 1 describe las escuelas del estudio.</w:t>
       </w:r>
     </w:p>
     <w:p>
@@ -765,25 +711,7 @@
         <w:jc w:val="both"/>
       </w:pPr>
       <w:r>
-        <w:t xml:space="preserve">El análisis fue </w:t>
-      </w:r>
-      <w:r>
-        <w:rPr>
-          <w:b/>
-        </w:rPr>
-        <w:t xml:space="preserve">temático de contenido</w:t>
-      </w:r>
-      <w:r>
-        <w:t xml:space="preserve">, organizado en cuatro categorías derivadas del marco teórico y abiertas a subcategorías emergentes: 1) organización y periodicidad del tequio escolar, incluida su convocatoria, frecuencia y tipo de tareas; 2) gestión de recursos del Comité de Administración Participativa y su relación con las jornadas de tequio; 3) sentido comunitario y reciprocidad atribuidos por las familias a esta práctica; y 4) tensiones de sobrecarga y desigualdad de género en la distribución del trabajo. El procedimiento comprendió codificación temática de las entrevistas transcritas y de las actas, construcción de matrices comparativas entre escuelas, y triangulación entre el discurso de los comités, el de los directivos y los registros documentales. Las cifras y los nombres de escuelas y localidades presentados en Resultados son </w:t>
-      </w:r>
-      <w:r>
-        <w:rPr>
-          <w:b/>
-        </w:rPr>
-        <w:t xml:space="preserve">datos ilustrativos con fines académicos</w:t>
-      </w:r>
-      <w:r>
-        <w:t xml:space="preserve">, construidos para exponer de forma sintética patrones documentados en la literatura y en el trabajo de campo; no constituyen estadísticas oficiales atribuidas a la región.</w:t>
+        <w:t xml:space="preserve">El análisis fue temático de contenido, organizado en cuatro categorías derivadas del marco teórico y abiertas a subcategorías emergentes: 1) organización y periodicidad del tequio escolar, incluida su convocatoria, frecuencia y tipo de tareas; 2) gestión de recursos del Comité de Administración Participativa y su relación con las jornadas de tequio; 3) sentido comunitario y reciprocidad atribuidos por las familias a esta práctica; y 4) tensiones de sobrecarga y desigualdad de género en la distribución del trabajo. El procedimiento comprendió codificación temática de las entrevistas transcritas y de las actas, construcción de matrices comparativas entre escuelas, y triangulación entre el discurso de los comités, el de los directivos y los registros documentales. Las cifras y los nombres de escuelas y localidades presentados en Resultados son datos ilustrativos con fines académicos, construidos para exponer de forma sintética patrones documentados en la literatura y en el trabajo de campo; no constituyen estadísticas oficiales atribuidas a la región.</w:t>
       </w:r>
     </w:p>
     <w:p>

</xml_diff>